<commit_message>
added the correcrt file names
</commit_message>
<xml_diff>
--- a/Cases/Spring/III Coffee Shop Sales/Kaiserliche Bhone_Imperial Bean.docx
+++ b/Cases/Spring/III Coffee Shop Sales/Kaiserliche Bhone_Imperial Bean.docx
@@ -347,7 +347,97 @@
           <w:kern w:val="0"/>
           <w14:ligatures w14:val="none"/>
         </w:rPr>
-        <w:t>You are provided with a single CSV file (Kaffeehaus_Kepler_Transactions.csv) containing transactional data recorded from the POS system.</w:t>
+        <w:t xml:space="preserve">You are provided with a </w:t>
+      </w:r>
+      <w:r>
+        <w:rPr>
+          <w:rFonts w:asciiTheme="majorHAnsi" w:eastAsia="Times New Roman" w:hAnsiTheme="majorHAnsi" w:cstheme="majorHAnsi"/>
+          <w:color w:val="1B1C1D"/>
+          <w:kern w:val="0"/>
+          <w14:ligatures w14:val="none"/>
+        </w:rPr>
+        <w:t>leveled</w:t>
+      </w:r>
+      <w:r>
+        <w:rPr>
+          <w:rFonts w:asciiTheme="majorHAnsi" w:eastAsia="Times New Roman" w:hAnsiTheme="majorHAnsi" w:cstheme="majorHAnsi"/>
+          <w:color w:val="1B1C1D"/>
+          <w:kern w:val="0"/>
+          <w14:ligatures w14:val="none"/>
+        </w:rPr>
+        <w:t xml:space="preserve"> CSV file</w:t>
+      </w:r>
+      <w:r>
+        <w:rPr>
+          <w:rFonts w:asciiTheme="majorHAnsi" w:eastAsia="Times New Roman" w:hAnsiTheme="majorHAnsi" w:cstheme="majorHAnsi"/>
+          <w:color w:val="1B1C1D"/>
+          <w:kern w:val="0"/>
+          <w14:ligatures w14:val="none"/>
+        </w:rPr>
+        <w:t>s</w:t>
+      </w:r>
+      <w:r>
+        <w:rPr>
+          <w:rFonts w:asciiTheme="majorHAnsi" w:eastAsia="Times New Roman" w:hAnsiTheme="majorHAnsi" w:cstheme="majorHAnsi"/>
+          <w:color w:val="1B1C1D"/>
+          <w:kern w:val="0"/>
+          <w14:ligatures w14:val="none"/>
+        </w:rPr>
+        <w:t xml:space="preserve"> (</w:t>
+      </w:r>
+      <w:r>
+        <w:rPr>
+          <w:rFonts w:asciiTheme="majorHAnsi" w:eastAsia="Times New Roman" w:hAnsiTheme="majorHAnsi" w:cstheme="majorHAnsi"/>
+          <w:color w:val="1B1C1D"/>
+          <w:kern w:val="0"/>
+          <w14:ligatures w14:val="none"/>
+        </w:rPr>
+        <w:t>3yr_coffee_data_easiest</w:t>
+      </w:r>
+      <w:r>
+        <w:rPr>
+          <w:rFonts w:asciiTheme="majorHAnsi" w:eastAsia="Times New Roman" w:hAnsiTheme="majorHAnsi" w:cstheme="majorHAnsi"/>
+          <w:color w:val="1B1C1D"/>
+          <w:kern w:val="0"/>
+          <w14:ligatures w14:val="none"/>
+        </w:rPr>
+        <w:t>.csv</w:t>
+      </w:r>
+      <w:r>
+        <w:rPr>
+          <w:rFonts w:asciiTheme="majorHAnsi" w:eastAsia="Times New Roman" w:hAnsiTheme="majorHAnsi" w:cstheme="majorHAnsi"/>
+          <w:color w:val="1B1C1D"/>
+          <w:kern w:val="0"/>
+          <w14:ligatures w14:val="none"/>
+        </w:rPr>
+        <w:t xml:space="preserve">, </w:t>
+      </w:r>
+      <w:r>
+        <w:rPr>
+          <w:rFonts w:asciiTheme="majorHAnsi" w:eastAsia="Times New Roman" w:hAnsiTheme="majorHAnsi" w:cstheme="majorHAnsi"/>
+          <w:color w:val="1B1C1D"/>
+          <w:kern w:val="0"/>
+          <w14:ligatures w14:val="none"/>
+        </w:rPr>
+        <w:t>3yr_coffee_data_medium</w:t>
+      </w:r>
+      <w:r>
+        <w:rPr>
+          <w:rFonts w:asciiTheme="majorHAnsi" w:eastAsia="Times New Roman" w:hAnsiTheme="majorHAnsi" w:cstheme="majorHAnsi"/>
+          <w:color w:val="1B1C1D"/>
+          <w:kern w:val="0"/>
+          <w14:ligatures w14:val="none"/>
+        </w:rPr>
+        <w:t xml:space="preserve"> or a folder of the raw transaction data export by year</w:t>
+      </w:r>
+      <w:r>
+        <w:rPr>
+          <w:rFonts w:asciiTheme="majorHAnsi" w:eastAsia="Times New Roman" w:hAnsiTheme="majorHAnsi" w:cstheme="majorHAnsi"/>
+          <w:color w:val="1B1C1D"/>
+          <w:kern w:val="0"/>
+          <w14:ligatures w14:val="none"/>
+        </w:rPr>
+        <w:t>) containing transactional data recorded from the POS system.</w:t>
       </w:r>
       <w:r>
         <w:rPr>
@@ -401,6 +491,16 @@
         </w:rPr>
         <w:t xml:space="preserve">  This is because it is real data! </w:t>
       </w:r>
+      <w:r>
+        <w:rPr>
+          <w:rFonts w:asciiTheme="majorHAnsi" w:eastAsia="Times New Roman" w:hAnsiTheme="majorHAnsi" w:cstheme="majorHAnsi"/>
+          <w:color w:val="1B1C1D"/>
+          <w:kern w:val="0"/>
+          <w:bdr w:val="none" w:sz="0" w:space="0" w:color="auto" w:frame="1"/>
+          <w14:ligatures w14:val="none"/>
+        </w:rPr>
+        <w:t xml:space="preserve">In the </w:t>
+      </w:r>
     </w:p>
     <w:p>
       <w:pPr>
@@ -477,6 +577,7 @@
           <w:bdr w:val="none" w:sz="0" w:space="0" w:color="auto" w:frame="1"/>
           <w14:ligatures w14:val="none"/>
         </w:rPr>
+        <w:lastRenderedPageBreak/>
         <w:t>Time Format: HH:</w:t>
       </w:r>
       <w:proofErr w:type="gramStart"/>
@@ -546,8 +647,27 @@
           <w:bdr w:val="none" w:sz="0" w:space="0" w:color="auto" w:frame="1"/>
           <w14:ligatures w14:val="none"/>
         </w:rPr>
-        <w:lastRenderedPageBreak/>
-        <w:t>Columns:</w:t>
+        <w:t>Columns</w:t>
+      </w:r>
+      <w:r>
+        <w:rPr>
+          <w:rFonts w:asciiTheme="majorHAnsi" w:eastAsia="Times New Roman" w:hAnsiTheme="majorHAnsi" w:cstheme="majorHAnsi"/>
+          <w:color w:val="1B1C1D"/>
+          <w:kern w:val="0"/>
+          <w:bdr w:val="none" w:sz="0" w:space="0" w:color="auto" w:frame="1"/>
+          <w14:ligatures w14:val="none"/>
+        </w:rPr>
+        <w:t xml:space="preserve"> in the easiest data file</w:t>
+      </w:r>
+      <w:r>
+        <w:rPr>
+          <w:rFonts w:asciiTheme="majorHAnsi" w:eastAsia="Times New Roman" w:hAnsiTheme="majorHAnsi" w:cstheme="majorHAnsi"/>
+          <w:color w:val="1B1C1D"/>
+          <w:kern w:val="0"/>
+          <w:bdr w:val="none" w:sz="0" w:space="0" w:color="auto" w:frame="1"/>
+          <w14:ligatures w14:val="none"/>
+        </w:rPr>
+        <w:t>:</w:t>
       </w:r>
     </w:p>
     <w:p>

</xml_diff>